<commit_message>
iteration 1 feedbacks completed & started with iteration 2
</commit_message>
<xml_diff>
--- a/Individual project/LO-06/Personal Leadership/Reflection document.docx
+++ b/Individual project/LO-06/Personal Leadership/Reflection document.docx
@@ -16,14 +16,7 @@
           <w:b/>
           <w:sz w:val="72"/>
         </w:rPr>
-        <w:t>Reflection</w:t>
-      </w:r>
-      <w:r>
-        <w:rPr>
-          <w:b/>
-          <w:sz w:val="72"/>
-        </w:rPr>
-        <w:t xml:space="preserve"> document</w:t>
+        <w:t>Reflection document</w:t>
       </w:r>
     </w:p>
     <w:p>
@@ -43,23 +36,13 @@
       </w:pPr>
       <w:bookmarkStart w:id="0" w:name="Projectnaam"/>
       <w:bookmarkStart w:id="1" w:name="_Toc327581041"/>
-      <w:proofErr w:type="spellStart"/>
       <w:r>
         <w:rPr>
           <w:b/>
           <w:i/>
           <w:sz w:val="52"/>
         </w:rPr>
-        <w:t>TruePartner</w:t>
-      </w:r>
-      <w:proofErr w:type="spellEnd"/>
-      <w:r>
-        <w:rPr>
-          <w:b/>
-          <w:i/>
-          <w:sz w:val="52"/>
-        </w:rPr>
-        <w:t xml:space="preserve"> </w:t>
+        <w:t xml:space="preserve">TruePartner </w:t>
       </w:r>
       <w:bookmarkEnd w:id="0"/>
     </w:p>
@@ -222,7 +205,7 @@
           <w:sz w:val="26"/>
           <w:szCs w:val="26"/>
         </w:rPr>
-        <w:t>2026-04-01</w:t>
+        <w:t>2026-04-02</w:t>
       </w:r>
       <w:r>
         <w:rPr>
@@ -292,22 +275,31 @@
         <w:t xml:space="preserve"> (car-rental service system)</w:t>
       </w:r>
       <w:r>
-        <w:t xml:space="preserve"> It covers my performance during the different sprints &amp; personal reflection on </w:t>
-      </w:r>
-      <w:proofErr w:type="gramStart"/>
-      <w:r>
-        <w:t>feedbacks</w:t>
-      </w:r>
-      <w:proofErr w:type="gramEnd"/>
-      <w:r>
-        <w:t>.</w:t>
+        <w:t xml:space="preserve"> It covers my performance during the different sprints &amp; personal reflection on feedbacks.</w:t>
       </w:r>
     </w:p>
     <w:p/>
     <w:p>
       <w:pPr>
         <w:pStyle w:val="Heading2"/>
-        <w:spacing w:line="360" w:lineRule="auto"/>
+        <w:rPr>
+          <w:b/>
+          <w:bCs/>
+          <w:color w:val="auto"/>
+        </w:rPr>
+      </w:pPr>
+      <w:r>
+        <w:rPr>
+          <w:b/>
+          <w:bCs/>
+          <w:color w:val="auto"/>
+        </w:rPr>
+        <w:t>Reflection on my performance (S.T.A.R.R Method)</w:t>
+      </w:r>
+    </w:p>
+    <w:p>
+      <w:pPr>
+        <w:pStyle w:val="Heading2"/>
         <w:rPr>
           <w:color w:val="auto"/>
           <w:sz w:val="20"/>
@@ -317,195 +309,1283 @@
       </w:pPr>
       <w:r>
         <w:rPr>
+          <w:rStyle w:val="Heading3Char"/>
           <w:b/>
           <w:bCs/>
           <w:color w:val="auto"/>
         </w:rPr>
-        <w:t>Reflection on my performance (S.T.A.R.R Method)</w:t>
-      </w:r>
-      <w:r>
+        <w:t>Iteration 1</w:t>
+      </w:r>
+    </w:p>
+    <w:p>
+      <w:pPr>
+        <w:spacing w:line="360" w:lineRule="auto"/>
+        <w:rPr>
+          <w:u w:val="single"/>
+        </w:rPr>
+      </w:pPr>
+      <w:r>
+        <w:rPr>
+          <w:u w:val="single"/>
+        </w:rPr>
+        <w:t xml:space="preserve">Checkpoint 2: </w:t>
+      </w:r>
+      <w:r>
+        <w:rPr>
+          <w:u w:val="single"/>
+        </w:rPr>
+        <w:t>Initial project idea</w:t>
+      </w:r>
+    </w:p>
+    <w:p>
+      <w:pPr>
+        <w:spacing w:line="360" w:lineRule="auto"/>
+      </w:pPr>
+      <w:r>
+        <w:rPr>
+          <w:b/>
+          <w:bCs/>
+        </w:rPr>
+        <w:t>Situation:</w:t>
+      </w:r>
+      <w:r>
+        <w:rPr>
+          <w:b/>
+          <w:bCs/>
+        </w:rPr>
+        <w:t xml:space="preserve"> </w:t>
+      </w:r>
+      <w:r>
+        <w:t>individual</w:t>
+      </w:r>
+      <w:r>
+        <w:rPr>
+          <w:b/>
+          <w:bCs/>
+        </w:rPr>
+        <w:t xml:space="preserve"> </w:t>
+      </w:r>
+      <w:r>
+        <w:t>project</w:t>
+      </w:r>
+      <w:r>
+        <w:rPr>
+          <w:b/>
+          <w:bCs/>
+        </w:rPr>
+        <w:t xml:space="preserve"> </w:t>
+      </w:r>
+      <w:r>
+        <w:t>kicks off</w:t>
+      </w:r>
+      <w:r>
+        <w:t xml:space="preserve">, </w:t>
+      </w:r>
+      <w:r>
+        <w:t>and I had to come up with an idea, possible functional requirements for the system and development approach.</w:t>
+      </w:r>
+    </w:p>
+    <w:p>
+      <w:pPr>
+        <w:spacing w:line="360" w:lineRule="auto"/>
+      </w:pPr>
+      <w:r>
+        <w:rPr>
+          <w:b/>
+          <w:bCs/>
+        </w:rPr>
+        <w:t>Task</w:t>
+      </w:r>
+      <w:r>
+        <w:rPr>
+          <w:b/>
+          <w:bCs/>
+        </w:rPr>
+        <w:t xml:space="preserve">: </w:t>
+      </w:r>
+      <w:r>
+        <w:t>Thinking of functional requirements, system specifications, database design.</w:t>
+      </w:r>
+    </w:p>
+    <w:p>
+      <w:pPr>
+        <w:spacing w:line="360" w:lineRule="auto"/>
+      </w:pPr>
+      <w:r>
+        <w:rPr>
+          <w:b/>
+          <w:bCs/>
+        </w:rPr>
+        <w:t xml:space="preserve">Action: </w:t>
+      </w:r>
+      <w:r>
+        <w:t>I did a research to explore existing rental systems for inspirations and possible example of what I could include in my project.</w:t>
+      </w:r>
+    </w:p>
+    <w:p>
+      <w:pPr>
+        <w:spacing w:line="360" w:lineRule="auto"/>
+      </w:pPr>
+      <w:r>
+        <w:rPr>
+          <w:b/>
+          <w:bCs/>
+        </w:rPr>
+        <w:t>Result</w:t>
+      </w:r>
+      <w:r>
+        <w:rPr>
+          <w:b/>
+          <w:bCs/>
+        </w:rPr>
+        <w:t xml:space="preserve">: </w:t>
+      </w:r>
+      <w:r>
+        <w:t xml:space="preserve">After the recommendation to go for </w:t>
+      </w:r>
+      <w:r>
+        <w:t>database-first approach, I started doing a class diagram + ERD diagram.</w:t>
+      </w:r>
+    </w:p>
+    <w:p>
+      <w:pPr>
+        <w:spacing w:line="360" w:lineRule="auto"/>
+      </w:pPr>
+      <w:r>
+        <w:rPr>
+          <w:b/>
+          <w:bCs/>
+        </w:rPr>
+        <w:t>Reflection</w:t>
+      </w:r>
+      <w:r>
+        <w:rPr>
+          <w:b/>
+          <w:bCs/>
+        </w:rPr>
+        <w:t xml:space="preserve">: </w:t>
+      </w:r>
+      <w:r>
+        <w:t xml:space="preserve">The initial brainstorming phase went </w:t>
+      </w:r>
+      <w:r>
+        <w:t>well;</w:t>
+      </w:r>
+      <w:r>
+        <w:t xml:space="preserve"> I got a validation and moved to planning phase.</w:t>
+      </w:r>
+    </w:p>
+    <w:p>
+      <w:pPr>
+        <w:spacing w:line="360" w:lineRule="auto"/>
+      </w:pPr>
+    </w:p>
+    <w:p>
+      <w:pPr>
+        <w:spacing w:line="360" w:lineRule="auto"/>
+        <w:rPr>
+          <w:u w:val="single"/>
+        </w:rPr>
+      </w:pPr>
+      <w:r>
+        <w:rPr>
+          <w:u w:val="single"/>
+        </w:rPr>
+        <w:t>Checkpoint</w:t>
+      </w:r>
+      <w:r>
+        <w:rPr>
+          <w:u w:val="single"/>
+        </w:rPr>
+        <w:t>s</w:t>
+      </w:r>
+      <w:r>
+        <w:rPr>
+          <w:u w:val="single"/>
+        </w:rPr>
+        <w:t xml:space="preserve"> 5, 6</w:t>
+      </w:r>
+      <w:r>
+        <w:rPr>
+          <w:u w:val="single"/>
+        </w:rPr>
+        <w:t>, 7</w:t>
+      </w:r>
+      <w:r>
+        <w:rPr>
+          <w:u w:val="single"/>
+        </w:rPr>
+        <w:t>:</w:t>
+      </w:r>
+      <w:r>
+        <w:rPr>
+          <w:u w:val="single"/>
+        </w:rPr>
+        <w:t xml:space="preserve"> Individual project documentation</w:t>
+      </w:r>
+    </w:p>
+    <w:p>
+      <w:pPr>
+        <w:spacing w:line="360" w:lineRule="auto"/>
+      </w:pPr>
+      <w:r>
+        <w:rPr>
+          <w:b/>
+          <w:bCs/>
+        </w:rPr>
+        <w:t>Situation</w:t>
+      </w:r>
+      <w:r>
+        <w:rPr>
+          <w:b/>
+          <w:bCs/>
+        </w:rPr>
+        <w:t xml:space="preserve">: </w:t>
+      </w:r>
+      <w:r>
+        <w:t>I</w:t>
+      </w:r>
+      <w:r>
+        <w:rPr>
+          <w:b/>
+          <w:bCs/>
+        </w:rPr>
+        <w:t xml:space="preserve"> </w:t>
+      </w:r>
+      <w:r>
+        <w:t>started writing my documentation (documents: project plan &amp; analysis) at this phase. Meanwhile, I asked for validation for initial stage of the documentation, and I got recommendations to use industry standard framework for reporting functional requirements, user requirements and stick to APA</w:t>
+      </w:r>
+      <w:r>
+        <w:t xml:space="preserve"> + JEE</w:t>
+      </w:r>
+      <w:r>
+        <w:t xml:space="preserve"> citation format. Regarding my</w:t>
+      </w:r>
+      <w:r>
+        <w:rPr>
+          <w:b/>
+          <w:bCs/>
+        </w:rPr>
+        <w:t xml:space="preserve"> </w:t>
+      </w:r>
+      <w:r>
+        <w:t>personal reflection I got recommended to use formal techniques of reporting like the S.T.A.R.R.</w:t>
+      </w:r>
+    </w:p>
+    <w:p>
+      <w:pPr>
+        <w:spacing w:line="360" w:lineRule="auto"/>
+      </w:pPr>
+      <w:r>
+        <w:rPr>
+          <w:b/>
+          <w:bCs/>
+        </w:rPr>
+        <w:t>Task:</w:t>
+      </w:r>
+      <w:r>
+        <w:rPr>
+          <w:b/>
+          <w:bCs/>
+        </w:rPr>
+        <w:t xml:space="preserve"> </w:t>
+      </w:r>
+      <w:r>
+        <w:t>Coming up with a clear way of writing functional requirements &amp; use cases.</w:t>
+      </w:r>
+    </w:p>
+    <w:p>
+      <w:pPr>
+        <w:spacing w:line="360" w:lineRule="auto"/>
+      </w:pPr>
+      <w:r>
+        <w:rPr>
+          <w:b/>
+          <w:bCs/>
+        </w:rPr>
+        <w:t>Action</w:t>
+      </w:r>
+      <w:r>
+        <w:rPr>
+          <w:b/>
+          <w:bCs/>
+        </w:rPr>
+        <w:t xml:space="preserve">: </w:t>
+      </w:r>
+      <w:r>
+        <w:t>Loo</w:t>
+      </w:r>
+      <w:r>
+        <w:t>king for sample templates for formatting functional requirements &amp; use cases.</w:t>
+      </w:r>
+    </w:p>
+    <w:p>
+      <w:pPr>
+        <w:spacing w:line="360" w:lineRule="auto"/>
+      </w:pPr>
+      <w:r>
+        <w:rPr>
+          <w:b/>
+          <w:bCs/>
+        </w:rPr>
+        <w:t>Result</w:t>
+      </w:r>
+      <w:r>
+        <w:rPr>
+          <w:b/>
+          <w:bCs/>
+        </w:rPr>
+        <w:t xml:space="preserve">: </w:t>
+      </w:r>
+      <w:r>
+        <w:t>Analysis &amp; URS documents became more readable with clear references between use case and functional requirement/s.</w:t>
+      </w:r>
+    </w:p>
+    <w:p>
+      <w:pPr>
+        <w:spacing w:line="360" w:lineRule="auto"/>
+        <w:rPr>
+          <w:b/>
+          <w:bCs/>
+        </w:rPr>
+      </w:pPr>
+      <w:r>
+        <w:rPr>
+          <w:b/>
+          <w:bCs/>
+        </w:rPr>
+        <w:t>Reflection:</w:t>
+      </w:r>
+      <w:r>
+        <w:rPr>
+          <w:b/>
+          <w:bCs/>
+        </w:rPr>
+        <w:t xml:space="preserve"> </w:t>
+      </w:r>
+      <w:r>
+        <w:t>I learned</w:t>
+      </w:r>
+      <w:r>
+        <w:t xml:space="preserve"> to p</w:t>
+      </w:r>
+      <w:r>
+        <w:t>ay</w:t>
+      </w:r>
+      <w:r>
+        <w:rPr>
+          <w:b/>
+          <w:bCs/>
+        </w:rPr>
+        <w:t xml:space="preserve"> </w:t>
+      </w:r>
+      <w:r>
+        <w:t>attention</w:t>
+      </w:r>
+      <w:r>
+        <w:rPr>
+          <w:b/>
+          <w:bCs/>
+        </w:rPr>
+        <w:t xml:space="preserve"> </w:t>
+      </w:r>
+      <w:r>
+        <w:t>to</w:t>
+      </w:r>
+      <w:r>
+        <w:t xml:space="preserve"> the way of reporting</w:t>
+      </w:r>
+      <w:r>
+        <w:t xml:space="preserve"> and became aware of standardize techniques the industry goes for.</w:t>
+      </w:r>
+      <w:r>
+        <w:rPr>
+          <w:b/>
+          <w:bCs/>
+        </w:rPr>
+        <w:t xml:space="preserve"> </w:t>
+      </w:r>
+    </w:p>
+    <w:p>
+      <w:pPr>
+        <w:spacing w:line="360" w:lineRule="auto"/>
+        <w:rPr>
+          <w:b/>
+          <w:bCs/>
+        </w:rPr>
+      </w:pPr>
+    </w:p>
+    <w:p>
+      <w:pPr>
+        <w:spacing w:line="360" w:lineRule="auto"/>
+        <w:rPr>
+          <w:u w:val="single"/>
+        </w:rPr>
+      </w:pPr>
+      <w:r>
+        <w:rPr>
+          <w:u w:val="single"/>
+        </w:rPr>
+        <w:t>Checkpoint 8: Project plan – ‘Research questions’</w:t>
+      </w:r>
+    </w:p>
+    <w:p>
+      <w:pPr>
+        <w:spacing w:line="360" w:lineRule="auto"/>
+        <w:jc w:val="both"/>
+      </w:pPr>
+      <w:r>
+        <w:rPr>
+          <w:b/>
+          <w:bCs/>
+        </w:rPr>
+        <w:t>Situation:</w:t>
+      </w:r>
+      <w:r>
+        <w:rPr>
+          <w:b/>
+          <w:bCs/>
+        </w:rPr>
+        <w:t xml:space="preserve"> </w:t>
+      </w:r>
+      <w:r>
+        <w:t>I went for validation for my ‘Research questions &amp; Methods’. It turned out that I might have misunderstood their purpose. After the check up I understood that they should applied research questions (measurable, such that could be implemented in my project) rather than being pure academic. And as far as the research methods are concerned, I got recommended to check if a given research method is indeed applicable to my project’s needs.</w:t>
+      </w:r>
+    </w:p>
+    <w:p>
+      <w:pPr>
+        <w:spacing w:line="360" w:lineRule="auto"/>
+      </w:pPr>
+      <w:r>
+        <w:rPr>
+          <w:b/>
+          <w:bCs/>
+        </w:rPr>
+        <w:t>Task:</w:t>
+      </w:r>
+      <w:r>
+        <w:rPr>
+          <w:b/>
+          <w:bCs/>
+        </w:rPr>
+        <w:t xml:space="preserve"> </w:t>
+      </w:r>
+      <w:r>
+        <w:t>I had to revise my research questions and check up with CMD methods for the research methods.</w:t>
+      </w:r>
+    </w:p>
+    <w:p>
+      <w:pPr>
+        <w:spacing w:line="360" w:lineRule="auto"/>
+      </w:pPr>
+      <w:r>
+        <w:rPr>
+          <w:b/>
+          <w:bCs/>
+        </w:rPr>
+        <w:t>Action:</w:t>
+      </w:r>
+      <w:r>
+        <w:rPr>
+          <w:b/>
+          <w:bCs/>
+        </w:rPr>
+        <w:t xml:space="preserve"> </w:t>
+      </w:r>
+      <w:r>
+        <w:t>Changing the direction of the research methodology.</w:t>
+      </w:r>
+    </w:p>
+    <w:p>
+      <w:pPr>
+        <w:spacing w:line="360" w:lineRule="auto"/>
+        <w:rPr>
+          <w:bCs/>
+        </w:rPr>
+      </w:pPr>
+      <w:r>
+        <w:rPr>
+          <w:b/>
+          <w:bCs/>
+        </w:rPr>
+        <w:lastRenderedPageBreak/>
+        <w:t>Result:</w:t>
+      </w:r>
+      <w:r>
+        <w:rPr>
+          <w:b/>
+          <w:bCs/>
+        </w:rPr>
+        <w:t xml:space="preserve"> </w:t>
+      </w:r>
+      <w:r>
+        <w:t>A</w:t>
+      </w:r>
+      <w:r>
+        <w:rPr>
+          <w:bCs/>
+        </w:rPr>
+        <w:t xml:space="preserve"> r</w:t>
+      </w:r>
+      <w:r>
+        <w:rPr>
+          <w:bCs/>
+        </w:rPr>
+        <w:t>esearch</w:t>
+      </w:r>
+      <w:r>
+        <w:rPr>
+          <w:bCs/>
+        </w:rPr>
+        <w:t xml:space="preserve"> </w:t>
+      </w:r>
+      <w:r>
+        <w:rPr>
+          <w:bCs/>
+        </w:rPr>
+        <w:t xml:space="preserve">that </w:t>
+      </w:r>
+      <w:r>
+        <w:rPr>
+          <w:bCs/>
+        </w:rPr>
+        <w:t>has an impact on my project’s development.</w:t>
+      </w:r>
+    </w:p>
+    <w:p>
+      <w:pPr>
+        <w:spacing w:line="360" w:lineRule="auto"/>
+        <w:rPr>
+          <w:bCs/>
+        </w:rPr>
+      </w:pPr>
+      <w:r>
+        <w:rPr>
+          <w:b/>
+        </w:rPr>
+        <w:t>Reflection:</w:t>
+      </w:r>
+      <w:r>
+        <w:rPr>
+          <w:b/>
+        </w:rPr>
+        <w:t xml:space="preserve"> </w:t>
+      </w:r>
+      <w:r>
+        <w:rPr>
+          <w:bCs/>
+        </w:rPr>
+        <w:t>In this phase I went with too general research approach and had to narrow down, optimally next time advising with coaches, would save me some time in redoing some of the research.</w:t>
+      </w:r>
+    </w:p>
+    <w:p>
+      <w:pPr>
+        <w:spacing w:line="360" w:lineRule="auto"/>
+        <w:rPr>
+          <w:bCs/>
+        </w:rPr>
+      </w:pPr>
+    </w:p>
+    <w:p>
+      <w:pPr>
+        <w:spacing w:line="360" w:lineRule="auto"/>
+        <w:rPr>
+          <w:bCs/>
+          <w:u w:val="single"/>
+        </w:rPr>
+      </w:pPr>
+      <w:r>
+        <w:rPr>
+          <w:bCs/>
+          <w:u w:val="single"/>
+        </w:rPr>
+        <w:t xml:space="preserve">Checkpoint 10: </w:t>
+      </w:r>
+      <w:r>
+        <w:rPr>
+          <w:bCs/>
+          <w:u w:val="single"/>
+        </w:rPr>
+        <w:t>Class Diagram &amp; ERD</w:t>
+      </w:r>
+    </w:p>
+    <w:p>
+      <w:pPr>
+        <w:spacing w:line="360" w:lineRule="auto"/>
+      </w:pPr>
+      <w:r>
+        <w:rPr>
+          <w:b/>
+        </w:rPr>
+        <w:t>Situation</w:t>
+      </w:r>
+      <w:r>
+        <w:t>: After</w:t>
+      </w:r>
+      <w:r>
+        <w:t xml:space="preserve"> the analysis phase, I jump into the design phase, where I receive an approval to get started with the realization part.</w:t>
+      </w:r>
+    </w:p>
+    <w:p>
+      <w:pPr>
+        <w:spacing w:line="360" w:lineRule="auto"/>
+      </w:pPr>
+      <w:r>
+        <w:rPr>
+          <w:b/>
+          <w:bCs/>
+        </w:rPr>
+        <w:t>Task:</w:t>
+      </w:r>
+      <w:r>
+        <w:rPr>
+          <w:b/>
+          <w:bCs/>
+        </w:rPr>
+        <w:t xml:space="preserve"> </w:t>
+      </w:r>
+      <w:r>
+        <w:t>I had to set up my development environment, project architecture</w:t>
+      </w:r>
+      <w:r>
+        <w:t>,</w:t>
+      </w:r>
+      <w:r>
+        <w:t xml:space="preserve"> </w:t>
+      </w:r>
+      <w:r>
+        <w:t>etc.</w:t>
+      </w:r>
+    </w:p>
+    <w:p>
+      <w:pPr>
+        <w:spacing w:line="360" w:lineRule="auto"/>
+      </w:pPr>
+      <w:r>
+        <w:rPr>
+          <w:b/>
+          <w:bCs/>
+        </w:rPr>
+        <w:t>Action:</w:t>
+      </w:r>
+      <w:r>
+        <w:rPr>
+          <w:b/>
+          <w:bCs/>
+        </w:rPr>
+        <w:t xml:space="preserve"> </w:t>
+      </w:r>
+      <w:r>
+        <w:t>I started implementing the first functional requirements &amp; setting up version control system.</w:t>
+      </w:r>
+    </w:p>
+    <w:p>
+      <w:pPr>
+        <w:spacing w:line="360" w:lineRule="auto"/>
+      </w:pPr>
+      <w:r>
+        <w:rPr>
+          <w:b/>
+          <w:bCs/>
+        </w:rPr>
+        <w:t>Result:</w:t>
+      </w:r>
+      <w:r>
+        <w:rPr>
+          <w:b/>
+          <w:bCs/>
+        </w:rPr>
+        <w:t xml:space="preserve"> </w:t>
+      </w:r>
+      <w:r>
+        <w:t xml:space="preserve">Minor functionalities </w:t>
+      </w:r>
+      <w:r>
+        <w:t>and room for testing to find errors and getting validation in early stage.</w:t>
+      </w:r>
+    </w:p>
+    <w:p>
+      <w:pPr>
+        <w:spacing w:line="360" w:lineRule="auto"/>
+      </w:pPr>
+      <w:r>
+        <w:rPr>
+          <w:b/>
+          <w:bCs/>
+        </w:rPr>
+        <w:t>Reflection:</w:t>
+      </w:r>
+      <w:r>
+        <w:rPr>
+          <w:b/>
+          <w:bCs/>
+        </w:rPr>
+        <w:t xml:space="preserve"> </w:t>
+      </w:r>
+      <w:r>
+        <w:t>Overall, after I had an initial design</w:t>
+      </w:r>
+      <w:r>
+        <w:t>,</w:t>
+      </w:r>
+      <w:r>
+        <w:t xml:space="preserve"> I started with the implementation right away which allowed me to get early feedback.</w:t>
+      </w:r>
+    </w:p>
+    <w:p>
+      <w:pPr>
+        <w:spacing w:line="360" w:lineRule="auto"/>
+      </w:pPr>
+    </w:p>
+    <w:p>
+      <w:pPr>
+        <w:spacing w:line="360" w:lineRule="auto"/>
+        <w:rPr>
+          <w:u w:val="single"/>
+        </w:rPr>
+      </w:pPr>
+      <w:r>
+        <w:rPr>
+          <w:u w:val="single"/>
+        </w:rPr>
+        <w:t>Checkpoint 11: Project management</w:t>
+      </w:r>
+    </w:p>
+    <w:p>
+      <w:pPr>
+        <w:spacing w:line="360" w:lineRule="auto"/>
+      </w:pPr>
+      <w:r>
+        <w:rPr>
+          <w:b/>
+          <w:bCs/>
+        </w:rPr>
+        <w:t>Situation:</w:t>
+      </w:r>
+      <w:r>
+        <w:rPr>
+          <w:b/>
+          <w:bCs/>
+        </w:rPr>
+        <w:t xml:space="preserve"> </w:t>
+      </w:r>
+      <w:r>
+        <w:t>After implementing the agile methodology</w:t>
+      </w:r>
+      <w:r>
+        <w:t xml:space="preserve"> as well as the design of my initial index page, I went for a validation</w:t>
+      </w:r>
+      <w:r>
+        <w:t xml:space="preserve"> and I was advised to add ticket description, giving a task certain tag (e.g. feature, design…) and align my index’s UI</w:t>
+      </w:r>
+      <w:r>
+        <w:t>.</w:t>
+      </w:r>
+    </w:p>
+    <w:p>
+      <w:pPr>
+        <w:spacing w:line="360" w:lineRule="auto"/>
+      </w:pPr>
+      <w:r>
+        <w:rPr>
+          <w:b/>
+          <w:bCs/>
+        </w:rPr>
+        <w:t>Task:</w:t>
+      </w:r>
+      <w:r>
+        <w:rPr>
+          <w:b/>
+          <w:bCs/>
+        </w:rPr>
+        <w:t xml:space="preserve"> </w:t>
+      </w:r>
+      <w:r>
+        <w:t>Using my project management system, I had to come up with a way to label each task for clarity as well as I had to come up with a way of unified styling.</w:t>
+      </w:r>
+    </w:p>
+    <w:p>
+      <w:pPr>
+        <w:spacing w:line="360" w:lineRule="auto"/>
+      </w:pPr>
+      <w:r>
+        <w:rPr>
+          <w:b/>
+          <w:bCs/>
+        </w:rPr>
+        <w:t>Action:</w:t>
+      </w:r>
+      <w:r>
+        <w:rPr>
+          <w:b/>
+          <w:bCs/>
+        </w:rPr>
+        <w:t xml:space="preserve"> </w:t>
+      </w:r>
+      <w:r>
+        <w:t xml:space="preserve">I found a way to add tickets to my task, sub-tasks by adding a pre-defined tags for each of them and </w:t>
+      </w:r>
+      <w:r>
+        <w:t>I came up with a unified grid system for the styling.</w:t>
+      </w:r>
+    </w:p>
+    <w:p>
+      <w:pPr>
+        <w:spacing w:line="360" w:lineRule="auto"/>
+      </w:pPr>
+      <w:r>
+        <w:rPr>
+          <w:b/>
+          <w:bCs/>
+        </w:rPr>
+        <w:t>Result:</w:t>
+      </w:r>
+      <w:r>
+        <w:rPr>
+          <w:b/>
+          <w:bCs/>
+        </w:rPr>
+        <w:t xml:space="preserve"> </w:t>
+      </w:r>
+      <w:r>
+        <w:t>Tasks, sub-tasks became more readable and clearer, the styling appears aligned.</w:t>
+      </w:r>
+    </w:p>
+    <w:p>
+      <w:pPr>
+        <w:spacing w:line="360" w:lineRule="auto"/>
+      </w:pPr>
+      <w:r>
+        <w:rPr>
+          <w:b/>
+          <w:bCs/>
+        </w:rPr>
+        <w:t>Reflection:</w:t>
+      </w:r>
+      <w:r>
+        <w:rPr>
+          <w:b/>
+          <w:bCs/>
+        </w:rPr>
+        <w:t xml:space="preserve"> </w:t>
+      </w:r>
+      <w:r>
+        <w:t>I should</w:t>
+      </w:r>
+      <w:r>
+        <w:t xml:space="preserve"> strive to the principle of decomposition, breaking down each task into a smaller one and treating it a</w:t>
+      </w:r>
+      <w:r>
+        <w:t>s a</w:t>
+      </w:r>
+      <w:r>
+        <w:t xml:space="preserve"> single unit</w:t>
+      </w:r>
+      <w:r>
+        <w:t>.</w:t>
+      </w:r>
+    </w:p>
+    <w:p>
+      <w:pPr>
+        <w:spacing w:line="360" w:lineRule="auto"/>
+      </w:pPr>
+    </w:p>
+    <w:p>
+      <w:pPr>
+        <w:spacing w:line="360" w:lineRule="auto"/>
+        <w:rPr>
+          <w:u w:val="single"/>
+        </w:rPr>
+      </w:pPr>
+      <w:r>
+        <w:rPr>
+          <w:u w:val="single"/>
+        </w:rPr>
+        <w:t>Checkpoint 12: First portfolio</w:t>
+      </w:r>
+      <w:r>
+        <w:rPr>
+          <w:u w:val="single"/>
+        </w:rPr>
+        <w:t xml:space="preserve"> iteration</w:t>
+      </w:r>
+      <w:r>
+        <w:rPr>
+          <w:u w:val="single"/>
+        </w:rPr>
+        <w:t xml:space="preserve"> review</w:t>
+      </w:r>
+    </w:p>
+    <w:p>
+      <w:pPr>
+        <w:spacing w:line="360" w:lineRule="auto"/>
+        <w:rPr>
+          <w:b/>
+          <w:bCs/>
+        </w:rPr>
+      </w:pPr>
+      <w:r>
+        <w:rPr>
+          <w:b/>
+          <w:bCs/>
+        </w:rPr>
+        <w:t>Situation:</w:t>
+      </w:r>
+      <w:r>
+        <w:rPr>
+          <w:b/>
+          <w:bCs/>
+        </w:rPr>
+        <w:t xml:space="preserve"> </w:t>
+      </w:r>
+      <w:r>
+        <w:t>First portfolio iteration post-submission review.</w:t>
+      </w:r>
+      <w:r>
+        <w:t xml:space="preserve"> During the talk, it became apparent that I have not submitted all of my evidences in Canva, which led to a misconception about my progress during that iteration.</w:t>
+      </w:r>
+    </w:p>
+    <w:p>
+      <w:pPr>
+        <w:spacing w:line="360" w:lineRule="auto"/>
+      </w:pPr>
+      <w:r>
+        <w:rPr>
+          <w:b/>
+          <w:bCs/>
+        </w:rPr>
+        <w:t>Task:</w:t>
+      </w:r>
+      <w:r>
+        <w:rPr>
+          <w:b/>
+          <w:bCs/>
+        </w:rPr>
+        <w:t xml:space="preserve"> </w:t>
+      </w:r>
+      <w:r>
+        <w:rPr>
+          <w:b/>
+          <w:bCs/>
+        </w:rPr>
+        <w:t xml:space="preserve"> </w:t>
+      </w:r>
+      <w:r>
+        <w:t>I had to prepare my documents in advance for the next portfolio submission.</w:t>
+      </w:r>
+    </w:p>
+    <w:p>
+      <w:pPr>
+        <w:spacing w:line="360" w:lineRule="auto"/>
+      </w:pPr>
+      <w:r>
+        <w:rPr>
+          <w:b/>
+          <w:bCs/>
+        </w:rPr>
+        <w:t>Action:</w:t>
+      </w:r>
+      <w:r>
+        <w:rPr>
+          <w:b/>
+          <w:bCs/>
+        </w:rPr>
+        <w:t xml:space="preserve"> </w:t>
+      </w:r>
+      <w:r>
+        <w:t>I</w:t>
+      </w:r>
+      <w:r>
+        <w:t xml:space="preserve"> started </w:t>
+      </w:r>
+      <w:r>
+        <w:t xml:space="preserve">writing </w:t>
+      </w:r>
+      <w:r>
+        <w:t>the documents I was missing</w:t>
+      </w:r>
+      <w:r>
+        <w:rPr>
+          <w:b/>
+          <w:bCs/>
+        </w:rPr>
+        <w:t xml:space="preserve"> </w:t>
+      </w:r>
+      <w:r>
+        <w:t>preparing the needed evidences per learning outcome.</w:t>
+      </w:r>
+    </w:p>
+    <w:p>
+      <w:pPr>
+        <w:spacing w:line="360" w:lineRule="auto"/>
+        <w:rPr>
+          <w:b/>
+          <w:bCs/>
+        </w:rPr>
+      </w:pPr>
+      <w:r>
+        <w:rPr>
+          <w:b/>
+          <w:bCs/>
+        </w:rPr>
+        <w:t>Result:</w:t>
+      </w:r>
+      <w:r>
+        <w:rPr>
+          <w:b/>
+          <w:bCs/>
+        </w:rPr>
+        <w:t xml:space="preserve"> </w:t>
+      </w:r>
+      <w:r>
+        <w:t>After</w:t>
+      </w:r>
+      <w:r>
+        <w:t xml:space="preserve"> composing the required documents, I could go for a validation and then upload them to my portfolio.</w:t>
+      </w:r>
+    </w:p>
+    <w:p>
+      <w:pPr>
+        <w:spacing w:line="360" w:lineRule="auto"/>
+      </w:pPr>
+      <w:r>
+        <w:rPr>
+          <w:b/>
+          <w:bCs/>
+        </w:rPr>
+        <w:t>Reflection:</w:t>
+      </w:r>
+      <w:r>
+        <w:rPr>
+          <w:b/>
+          <w:bCs/>
+        </w:rPr>
+        <w:t xml:space="preserve"> </w:t>
+      </w:r>
+      <w:r>
+        <w:t>While</w:t>
+      </w:r>
+      <w:r>
+        <w:t xml:space="preserve"> I was into the development part, I might have neglected some of the documentation, which I fixed right after the review talk.</w:t>
+      </w:r>
+    </w:p>
+    <w:p>
+      <w:pPr>
+        <w:spacing w:line="360" w:lineRule="auto"/>
+      </w:pPr>
+    </w:p>
+    <w:p>
+      <w:pPr>
+        <w:pStyle w:val="Heading3"/>
         <w:rPr>
           <w:b/>
           <w:bCs/>
           <w:color w:val="auto"/>
         </w:rPr>
-        <w:br/>
-      </w:r>
-      <w:r>
-        <w:rPr>
+      </w:pPr>
+      <w:r>
+        <w:rPr>
+          <w:b/>
+          <w:bCs/>
           <w:color w:val="auto"/>
-          <w:sz w:val="20"/>
-          <w:szCs w:val="20"/>
+        </w:rPr>
+        <w:lastRenderedPageBreak/>
+        <w:t>Iteration 2</w:t>
+      </w:r>
+    </w:p>
+    <w:p>
+      <w:pPr>
+        <w:spacing w:line="360" w:lineRule="auto"/>
+        <w:rPr>
           <w:u w:val="single"/>
         </w:rPr>
-        <w:t>Checkpoint 2</w:t>
-      </w:r>
-      <w:r>
-        <w:rPr>
-          <w:color w:val="auto"/>
-          <w:sz w:val="20"/>
-          <w:szCs w:val="20"/>
+      </w:pPr>
+      <w:r>
+        <w:rPr>
           <w:u w:val="single"/>
         </w:rPr>
+        <w:t>Checkpoint 13: Database design &amp; development approach</w:t>
+      </w:r>
+    </w:p>
+    <w:p>
+      <w:pPr>
+        <w:spacing w:line="360" w:lineRule="auto"/>
+      </w:pPr>
+      <w:r>
+        <w:rPr>
+          <w:b/>
+          <w:bCs/>
+        </w:rPr>
+        <w:t>Situation</w:t>
+      </w:r>
+      <w:r>
+        <w:rPr>
+          <w:b/>
+          <w:bCs/>
+        </w:rPr>
         <w:t xml:space="preserve">: </w:t>
       </w:r>
       <w:r>
         <w:rPr>
-          <w:color w:val="auto"/>
-          <w:sz w:val="20"/>
-          <w:szCs w:val="20"/>
-          <w:u w:val="single"/>
-        </w:rPr>
-        <w:t>Initial project idea</w:t>
-      </w:r>
-    </w:p>
-    <w:p>
-      <w:pPr>
-        <w:spacing w:line="360" w:lineRule="auto"/>
-      </w:pPr>
-      <w:r>
-        <w:rPr>
-          <w:b/>
-          <w:bCs/>
-        </w:rPr>
-        <w:t>Situation:</w:t>
-      </w:r>
-      <w:r>
-        <w:rPr>
-          <w:b/>
-          <w:bCs/>
-        </w:rPr>
-        <w:t xml:space="preserve"> </w:t>
-      </w:r>
-      <w:r>
-        <w:t>individual</w:t>
-      </w:r>
-      <w:r>
-        <w:rPr>
-          <w:b/>
-          <w:bCs/>
-        </w:rPr>
-        <w:t xml:space="preserve"> </w:t>
-      </w:r>
-      <w:r>
-        <w:t>project</w:t>
-      </w:r>
-      <w:r>
-        <w:rPr>
-          <w:b/>
-          <w:bCs/>
-        </w:rPr>
-        <w:t xml:space="preserve"> </w:t>
-      </w:r>
-      <w:r>
-        <w:t>kicks off</w:t>
-      </w:r>
-      <w:r>
-        <w:t xml:space="preserve">, </w:t>
-      </w:r>
-      <w:r>
-        <w:t>and I had to come up with an idea, possible functional requirements for the system and development approach.</w:t>
-      </w:r>
-    </w:p>
-    <w:p>
-      <w:pPr>
-        <w:spacing w:line="360" w:lineRule="auto"/>
-      </w:pPr>
-      <w:r>
-        <w:rPr>
-          <w:b/>
-          <w:bCs/>
-        </w:rPr>
-        <w:t>Task</w:t>
-      </w:r>
-      <w:r>
-        <w:rPr>
-          <w:b/>
-          <w:bCs/>
-        </w:rPr>
-        <w:t xml:space="preserve">: </w:t>
-      </w:r>
-      <w:r>
-        <w:t>Thinking of functional requirements, system specifications, database design.</w:t>
-      </w:r>
-    </w:p>
-    <w:p>
-      <w:pPr>
-        <w:spacing w:line="360" w:lineRule="auto"/>
-      </w:pPr>
-      <w:r>
-        <w:rPr>
-          <w:b/>
-          <w:bCs/>
-        </w:rPr>
-        <w:t xml:space="preserve">Action: </w:t>
-      </w:r>
-      <w:r>
-        <w:t xml:space="preserve">I did </w:t>
-      </w:r>
-      <w:proofErr w:type="gramStart"/>
-      <w:r>
-        <w:t>a research</w:t>
-      </w:r>
-      <w:proofErr w:type="gramEnd"/>
-      <w:r>
-        <w:t xml:space="preserve"> to explore existing rental systems for inspirations and possible example of what I could include in my project.</w:t>
-      </w:r>
-    </w:p>
-    <w:p>
-      <w:pPr>
-        <w:spacing w:line="360" w:lineRule="auto"/>
-      </w:pPr>
-      <w:r>
-        <w:rPr>
-          <w:b/>
-          <w:bCs/>
-        </w:rPr>
-        <w:t>Result</w:t>
-      </w:r>
-      <w:r>
-        <w:rPr>
-          <w:b/>
-          <w:bCs/>
-        </w:rPr>
-        <w:t xml:space="preserve">: </w:t>
-      </w:r>
-      <w:r>
-        <w:t xml:space="preserve">After the recommendation to go for </w:t>
-      </w:r>
-      <w:r>
-        <w:t>database-first approach, I started doing a class diagram + ERD diagram.</w:t>
-      </w:r>
-    </w:p>
-    <w:p>
-      <w:pPr>
-        <w:spacing w:line="360" w:lineRule="auto"/>
-      </w:pPr>
-      <w:r>
-        <w:rPr>
-          <w:b/>
-          <w:bCs/>
-        </w:rPr>
-        <w:t>Reflection</w:t>
-      </w:r>
-      <w:r>
-        <w:rPr>
-          <w:b/>
-          <w:bCs/>
-        </w:rPr>
-        <w:t xml:space="preserve">: </w:t>
-      </w:r>
-      <w:r>
-        <w:t xml:space="preserve">The initial brainstorming phase went </w:t>
-      </w:r>
-      <w:r>
-        <w:t>well;</w:t>
-      </w:r>
-      <w:r>
-        <w:t xml:space="preserve"> I got a validation and moved to planning phase.</w:t>
-      </w:r>
-    </w:p>
-    <w:p/>
+          <w:b/>
+          <w:bCs/>
+        </w:rPr>
+        <w:t xml:space="preserve"> </w:t>
+      </w:r>
+      <w:r>
+        <w:rPr>
+          <w:bCs/>
+        </w:rPr>
+        <w:t>That</w:t>
+      </w:r>
+      <w:r>
+        <w:rPr>
+          <w:bCs/>
+        </w:rPr>
+        <w:t xml:space="preserve"> checkpoint showcasing my current implementation of functional requirements</w:t>
+      </w:r>
+      <w:r>
+        <w:rPr>
+          <w:bCs/>
+        </w:rPr>
+        <w:t xml:space="preserve"> and checking up with my technical coaches for</w:t>
+      </w:r>
+      <w:r>
+        <w:rPr>
+          <w:bCs/>
+        </w:rPr>
+        <w:t xml:space="preserve"> using certain libraries.</w:t>
+      </w:r>
+      <w:r>
+        <w:rPr>
+          <w:bCs/>
+        </w:rPr>
+        <w:t xml:space="preserve"> </w:t>
+      </w:r>
+      <w:r>
+        <w:rPr>
+          <w:bCs/>
+        </w:rPr>
+        <w:t>I got recommendations to refactor my code.</w:t>
+      </w:r>
+    </w:p>
+    <w:p>
+      <w:pPr>
+        <w:spacing w:line="360" w:lineRule="auto"/>
+      </w:pPr>
+      <w:r>
+        <w:rPr>
+          <w:b/>
+          <w:bCs/>
+        </w:rPr>
+        <w:t>Task:</w:t>
+      </w:r>
+      <w:r>
+        <w:rPr>
+          <w:b/>
+          <w:bCs/>
+        </w:rPr>
+        <w:t xml:space="preserve"> </w:t>
+      </w:r>
+      <w:r>
+        <w:t>Get</w:t>
+      </w:r>
+      <w:r>
+        <w:t>t</w:t>
+      </w:r>
+      <w:r>
+        <w:t>ing</w:t>
+      </w:r>
+      <w:r>
+        <w:rPr>
+          <w:b/>
+          <w:bCs/>
+        </w:rPr>
+        <w:t xml:space="preserve"> </w:t>
+      </w:r>
+      <w:r>
+        <w:t>rid of left overs I had, left from testing the database connection.</w:t>
+      </w:r>
+    </w:p>
+    <w:p>
+      <w:pPr>
+        <w:spacing w:line="360" w:lineRule="auto"/>
+      </w:pPr>
+      <w:r>
+        <w:rPr>
+          <w:b/>
+          <w:bCs/>
+        </w:rPr>
+        <w:t>Action:</w:t>
+      </w:r>
+      <w:r>
+        <w:rPr>
+          <w:b/>
+          <w:bCs/>
+        </w:rPr>
+        <w:t xml:space="preserve"> </w:t>
+      </w:r>
+      <w:r>
+        <w:t xml:space="preserve">I </w:t>
+      </w:r>
+      <w:r>
+        <w:t>had to evaluate which part to remain and what is left to be refactored.</w:t>
+      </w:r>
+    </w:p>
+    <w:p>
+      <w:pPr>
+        <w:spacing w:line="360" w:lineRule="auto"/>
+      </w:pPr>
+      <w:r>
+        <w:rPr>
+          <w:b/>
+          <w:bCs/>
+        </w:rPr>
+        <w:t>Result:</w:t>
+      </w:r>
+      <w:r>
+        <w:rPr>
+          <w:b/>
+          <w:bCs/>
+        </w:rPr>
+        <w:t xml:space="preserve"> </w:t>
+      </w:r>
+      <w:r>
+        <w:t>More readable and maintainable project.</w:t>
+      </w:r>
+    </w:p>
+    <w:p>
+      <w:pPr>
+        <w:spacing w:line="360" w:lineRule="auto"/>
+        <w:rPr>
+          <w:b/>
+          <w:bCs/>
+        </w:rPr>
+      </w:pPr>
+      <w:r>
+        <w:rPr>
+          <w:b/>
+          <w:bCs/>
+        </w:rPr>
+        <w:t>Reflection:</w:t>
+      </w:r>
+      <w:r>
+        <w:rPr>
+          <w:b/>
+          <w:bCs/>
+        </w:rPr>
+        <w:t xml:space="preserve"> </w:t>
+      </w:r>
+      <w:r>
+        <w:t>I felt</w:t>
+      </w:r>
+      <w:r>
+        <w:t xml:space="preserve"> that getting validation early and checking up with my coaches will prevent later misunderstandings and</w:t>
+      </w:r>
+      <w:r>
+        <w:t xml:space="preserve"> suggest seamless work.</w:t>
+      </w:r>
+    </w:p>
     <w:sectPr>
       <w:pgSz w:w="12240" w:h="15840"/>
       <w:pgMar w:top="1440" w:right="1440" w:bottom="1440" w:left="1440" w:header="720" w:footer="720" w:gutter="0"/>
@@ -982,7 +2062,6 @@
     <w:next w:val="Normal"/>
     <w:link w:val="Heading3Char"/>
     <w:uiPriority w:val="9"/>
-    <w:semiHidden/>
     <w:unhideWhenUsed/>
     <w:qFormat/>
     <w:rsid w:val="009D38C5"/>
@@ -1189,7 +2268,6 @@
     <w:basedOn w:val="DefaultParagraphFont"/>
     <w:link w:val="Heading3"/>
     <w:uiPriority w:val="9"/>
-    <w:semiHidden/>
     <w:rsid w:val="009D38C5"/>
     <w:rPr>
       <w:rFonts w:eastAsiaTheme="majorEastAsia" w:cstheme="majorBidi"/>

</xml_diff>